<commit_message>
Staging deploy 2026-10-30: docs (staging email live for the Coffee Report, scheduler, Telegram token to re-enter), requirements and to-do updated
Co-Authored-By: Claude Opus 5.5 <noreply@anthropic.com>
</commit_message>
<xml_diff>
--- a/docs/requirements/Honcho_Requirements.docx
+++ b/docs/requirements/Honcho_Requirements.docx
@@ -1838,7 +1838,7 @@
                 <w:sz w:val="19"/>
                 <w:szCs w:val="19"/>
               </w:rPr>
-              <w:t xml:space="preserve">Connections and Coffee Report built on the Mac, not deployed; alerts, connector, chat and changes planned; two-tier split awaiting sign-off</w:t>
+              <w:t xml:space="preserve">Connections and Coffee Report built and on staging (daily report running); alerts, connector, chat and changes planned; two-tier split awaiting sign-off</w:t>
             </w:r>
           </w:p>
         </w:tc>
@@ -2323,13 +2323,13 @@
           <w:b/>
           <w:bCs/>
         </w:rPr>
-        <w:t xml:space="preserve">Deploy what's waiting</w:t>
-      </w:r>
-      <w:r>
-        <w:rPr>
-          <w:rFonts w:ascii="Calibri" w:cs="Calibri" w:eastAsia="Calibri" w:hAnsi="Calibri"/>
-        </w:rPr>
-        <w:t xml:space="preserve"> to staging (everything since the last deploy: AI phases 0 and 1, Help pages, guides, side menu and library fixes), with its migrations and settings. Always asked first.</w:t>
+        <w:t xml:space="preserve">Deploy what's waiting:</w:t>
+      </w:r>
+      <w:r>
+        <w:rPr>
+          <w:rFonts w:ascii="Calibri" w:cs="Calibri" w:eastAsia="Calibri" w:hAnsi="Calibri"/>
+        </w:rPr>
+        <w:t xml:space="preserve"> done 30 Oct 2026 (AI phases 0 and 1, the Coffee Report with its scheduler, Help pages, guides, side menu and library fixes).</w:t>
       </w:r>
     </w:p>
     <w:p>
@@ -29795,7 +29795,7 @@
         <w:rPr>
           <w:rFonts w:ascii="Calibri" w:cs="Calibri" w:eastAsia="Calibri" w:hAnsi="Calibri"/>
         </w:rPr>
-        <w:t xml:space="preserve">Everything marked Built is on the Mac only (built 29-30 Oct 2026), not yet deployed to staging.</w:t>
+        <w:t xml:space="preserve">Everything marked Built was built 29-30 Oct 2026 and deployed to staging on 30 Oct 2026 (Help-linked guides and Sports included).</w:t>
       </w:r>
     </w:p>
     <w:p>
@@ -32064,7 +32064,7 @@
                 <w:sz w:val="19"/>
                 <w:szCs w:val="19"/>
               </w:rPr>
-              <w:t xml:space="preserve">Built 29 Oct 2026 (Mac). Staging needs the key, the mail sender settings and the scheduler line</w:t>
+              <w:t xml:space="preserve">Built 29 Oct 2026; running on staging since 30 Oct 2026 (first scheduled report sent that day)</w:t>
             </w:r>
           </w:p>
         </w:tc>
@@ -32995,7 +32995,23 @@
         <w:rPr>
           <w:rFonts w:ascii="Calibri" w:cs="Calibri" w:eastAsia="Calibri" w:hAnsi="Calibri"/>
         </w:rPr>
-        <w:t xml:space="preserve">Not deployed yet; until an Anthropic API key is entered, reports go out as plain facts.</w:t>
+        <w:t xml:space="preserve">Until an Anthropic API key is entered (on staging and the Mac), reports go out as plain facts.</w:t>
+      </w:r>
+    </w:p>
+    <w:p>
+      <w:pPr>
+        <w:pStyle w:val="ListParagraph"/>
+        <w:numPr>
+          <w:ilvl w:val="0"/>
+          <w:numId w:val="3"/>
+        </w:numPr>
+        <w:spacing w:after="100"/>
+      </w:pPr>
+      <w:r>
+        <w:rPr>
+          <w:rFonts w:ascii="Calibri" w:cs="Calibri" w:eastAsia="Calibri" w:hAnsi="Calibri"/>
+        </w:rPr>
+        <w:t xml:space="preserve">National's Telegram delivery on staging is off until the bot token is pasted on the staging settings page (a token encrypted on one server can't be read on another).</w:t>
       </w:r>
     </w:p>
     <w:p>
@@ -52126,7 +52142,98 @@
         <w:rPr>
           <w:rFonts w:ascii="Calibri" w:cs="Calibri" w:eastAsia="Calibri" w:hAnsi="Calibri"/>
         </w:rPr>
-        <w:t xml:space="preserve">; still to do on servers: MAIL_FROM_EMAIL, COFFEE_CRON_KEY and the crontab line). Scheduled job: for each scope due, run its sections' scripts, pass the results to that scope's AI connection to assemble the report, and send it through Brevo; with no connection or at the limit, send the plain numbers. Keep each sent report (archive page per scope), log failures and email the scope's admins when a report can't be sent.</w:t>
+        <w:t xml:space="preserve">; on staging since 2026-10-30: MAIL_FROM_*, COFFEE_CRON_KEY, the new Brevo key, </w:t>
+      </w:r>
+      <w:r>
+        <w:rPr>
+          <w:rFonts w:ascii="Consolas" w:cs="Consolas" w:eastAsia="Consolas" w:hAnsi="Consolas"/>
+          <w:color w:val="B02020"/>
+          <w:sz w:val="20"/>
+          <w:szCs w:val="20"/>
+        </w:rPr>
+        <w:t xml:space="preserve">WHATENV=prod</w:t>
+      </w:r>
+      <w:r>
+        <w:rPr>
+          <w:rFonts w:ascii="Calibri" w:cs="Calibri" w:eastAsia="Calibri" w:hAnsi="Calibri"/>
+        </w:rPr>
+        <w:t xml:space="preserve"> in </w:t>
+      </w:r>
+      <w:r>
+        <w:rPr>
+          <w:rFonts w:ascii="Consolas" w:cs="Consolas" w:eastAsia="Consolas" w:hAnsi="Consolas"/>
+          <w:color w:val="B02020"/>
+          <w:sz w:val="20"/>
+          <w:szCs w:val="20"/>
+        </w:rPr>
+        <w:t xml:space="preserve">~/stack/staging.env</w:t>
+      </w:r>
+      <w:r>
+        <w:rPr>
+          <w:rFonts w:ascii="Calibri" w:cs="Calibri" w:eastAsia="Calibri" w:hAnsi="Calibri"/>
+        </w:rPr>
+        <w:t xml:space="preserve"> (old file kept as </w:t>
+      </w:r>
+      <w:r>
+        <w:rPr>
+          <w:rFonts w:ascii="Consolas" w:cs="Consolas" w:eastAsia="Consolas" w:hAnsi="Consolas"/>
+          <w:color w:val="B02020"/>
+          <w:sz w:val="20"/>
+          <w:szCs w:val="20"/>
+        </w:rPr>
+        <w:t xml:space="preserve">staging.env.bak-2026-10-30</w:t>
+      </w:r>
+      <w:r>
+        <w:rPr>
+          <w:rFonts w:ascii="Calibri" w:cs="Calibri" w:eastAsia="Calibri" w:hAnsi="Calibri"/>
+        </w:rPr>
+        <w:t xml:space="preserve">), crontab every 15 minutes; first scheduled report sent to Eric and David that day). Scheduled job: for each scope due, run its sections' scripts, pass the results to that scope's AI connection to assemble the report, and send it through Brevo; with no connection or at the limit, send the plain numbers. Keep each sent report (archive page per scope), log failures and email the scope's admins when a report can't be sent.</w:t>
+      </w:r>
+    </w:p>
+    <w:p>
+      <w:pPr>
+        <w:pStyle w:val="ListParagraph"/>
+        <w:numPr>
+          <w:ilvl w:val="0"/>
+          <w:numId w:val="3"/>
+        </w:numPr>
+        <w:spacing w:after="100"/>
+      </w:pPr>
+      <w:r>
+        <w:rPr>
+          <w:rFonts w:ascii="Calibri" w:cs="Calibri" w:eastAsia="Calibri" w:hAnsi="Calibri"/>
+        </w:rPr>
+        <w:t xml:space="preserve">☐ </w:t>
+      </w:r>
+      <w:r>
+        <w:rPr>
+          <w:rFonts w:ascii="Calibri" w:cs="Calibri" w:eastAsia="Calibri" w:hAnsi="Calibri"/>
+          <w:b/>
+          <w:bCs/>
+        </w:rPr>
+        <w:t xml:space="preserve">Staging Telegram:</w:t>
+      </w:r>
+      <w:r>
+        <w:rPr>
+          <w:rFonts w:ascii="Calibri" w:cs="Calibri" w:eastAsia="Calibri" w:hAnsi="Calibri"/>
+        </w:rPr>
+        <w:t xml:space="preserve"> paste National's bot token on the staging Coffee Report settings page and tick Send to Telegram (tokens encrypted on the Mac can't be read on staging).</w:t>
+      </w:r>
+    </w:p>
+    <w:p>
+      <w:pPr>
+        <w:pStyle w:val="ListParagraph"/>
+        <w:numPr>
+          <w:ilvl w:val="0"/>
+          <w:numId w:val="3"/>
+        </w:numPr>
+        <w:spacing w:after="100"/>
+      </w:pPr>
+      <w:r>
+        <w:rPr>
+          <w:rFonts w:ascii="Calibri" w:cs="Calibri" w:eastAsia="Calibri" w:hAnsi="Calibri"/>
+        </w:rPr>
+        <w:t xml:space="preserve">☐ Add an Anthropic API key (Haiku is cheapest) on staging's AI Connections so reports are AI-written.</w:t>
       </w:r>
     </w:p>
     <w:p>

</xml_diff>